<commit_message>
Fix docx structure: nested nav lists + hero content no longer flattened
- Nested lists (nav submenus) now render anidados by indent level instead
  of being flattened into the parent item and duplicated below, which had
  left nav.docx un-renderable when uploaded to Drive.
- Block cells recurse into wrapper <div>s, so the home hero renders as
  heading + paragraph + bulleted list + metric rows instead of one flat
  blob of text. Regenerated all 14 drive-docs/*.docx.

Co-Authored-By: Claude Opus 4.8 (1M context) <noreply@anthropic.com>
</commit_message>
<xml_diff>
--- a/drive-docs/blog.docx
+++ b/drive-docs/blog.docx
@@ -192,7 +192,7 @@
             <w:pPr>
               <w:pStyle w:val="Heading3"/>
             </w:pPr>
-            <w:hyperlink w:history="1" r:id="rIdny2b4eygmfrnu4igjaf0a">
+            <w:hyperlink w:history="1" r:id="rIdyableje6r_jzt2_chnffa">
               <w:r>
                 <w:rPr>
                   <w:rStyle w:val="Hyperlink"/>
@@ -329,7 +329,7 @@
             <w:pPr>
               <w:pStyle w:val="Heading3"/>
             </w:pPr>
-            <w:hyperlink w:history="1" r:id="rIdybqwgss-w3b8zfineszba">
+            <w:hyperlink w:history="1" r:id="rId-p9nx_2w2_vin8hesed8k">
               <w:r>
                 <w:rPr>
                   <w:rStyle w:val="Hyperlink"/>
@@ -466,7 +466,7 @@
             <w:pPr>
               <w:pStyle w:val="Heading3"/>
             </w:pPr>
-            <w:hyperlink w:history="1" r:id="rIdlav1qn6oozs3xf6p0_g52">
+            <w:hyperlink w:history="1" r:id="rIdq5uc0thtmo-prp2lr_jzk">
               <w:r>
                 <w:rPr>
                   <w:rStyle w:val="Hyperlink"/>
@@ -603,7 +603,7 @@
             <w:pPr>
               <w:pStyle w:val="Heading3"/>
             </w:pPr>
-            <w:hyperlink w:history="1" r:id="rIdzg1u5mn2uk3ag1evzkmjq">
+            <w:hyperlink w:history="1" r:id="rIdvsy7tebkxo44um81sdrmr">
               <w:r>
                 <w:rPr>
                   <w:rStyle w:val="Hyperlink"/>
@@ -740,7 +740,7 @@
             <w:pPr>
               <w:pStyle w:val="Heading3"/>
             </w:pPr>
-            <w:hyperlink w:history="1" r:id="rIdb8gzh2_izw_ckwyhqwnta">
+            <w:hyperlink w:history="1" r:id="rIdww6eqb4xb4ykzb6wgdxvf">
               <w:r>
                 <w:rPr>
                   <w:rStyle w:val="Hyperlink"/>

</xml_diff>